<commit_message>
Apply second hostile review corrections
</commit_message>
<xml_diff>
--- a/docs/manuscript/GCerrHMM_BMC_Research_article_W3.8_review_with_figures_20261014.docx
+++ b/docs/manuscript/GCerrHMM_BMC_Research_article_W3.8_review_with_figures_20261014.docx
@@ -30,7 +30,7 @@
           <w:sz w:val="26"/>
           <w:szCs w:val="26"/>
         </w:rPr>
-        <w:t>[Author names]</w:t>
+        <w:t>Boyang Zhang1, Tao Jiang2,*</w:t>
       </w:r>
     </w:p>
     <w:p>
@@ -46,7 +46,7 @@
           <w:sz w:val="24"/>
           <w:szCs w:val="24"/>
         </w:rPr>
-        <w:t>[Affiliations]</w:t>
+        <w:t>1 Faculty of Life Science and Medicine, Harbin Institute of Technology, Harbin, China; 2 Faculty of Computing, Harbin Institute of Technology, Harbin, China.</w:t>
       </w:r>
     </w:p>
     <w:p>
@@ -61,7 +61,7 @@
           <w:sz w:val="24"/>
           <w:szCs w:val="24"/>
         </w:rPr>
-        <w:t>Corresponding author: [AUTHOR INPUT REQUIRED: name, affiliation and email].</w:t>
+        <w:t>Corresponding author: Tao Jiang, Faculty of Computing, Harbin Institute of Technology, Harbin, China.</w:t>
       </w:r>
       <w:r>
         <w:rPr>
@@ -180,7 +180,7 @@
           <w:sz w:val="24"/>
           <w:szCs w:val="24"/>
         </w:rPr>
-        <w:t>We present GCerrHMM, a transition-based error HMM trained on real ONT alignments whose state-transition model is conditioned on local GC content, with a reproducible fidelity harness. The model is evaluated with a controlled one-bin versus GC-aware ablation, a six-genome directional panel, and coverage-matched human chr21 downstream layers. GC-aware simulation moved the local GC-error curve in the expected direction for four of six genomes in both replicates; the strict cross-species gate was not met, so the cross-species result remains directional. In A. thaliana, five or more bins raised curve correlation from r = 0.779 (SD 0.062) to r &gt;= 0.960. A second, pre-specified six-seed cohort confirmed the single-species effect (mean delta r = 0.3008; 95% CI 0.1624 to 0.4391; paired t-test p = 0.0025), while the original cross-species gate remains unchanged. The harness separates read-sampling from between-window uncertainty, and process-level scaling preserves FASTQ identity while reducing wall time.</w:t>
+        <w:t>We present GCerrHMM, a transition-based error HMM trained on real ONT alignments whose state-transition model is conditioned on local GC content, with a reproducible fidelity harness. The model is evaluated with a controlled one-bin versus GC-aware ablation, a six-genome directional panel, and coverage-matched human chr21 downstream layers. GC-aware simulation moved the local GC-error curve in the expected direction for four of six genomes in both replicates; the strict cross-species gate was not met, so the cross-species result remains directional. In A. thaliana, a second pre-specified six-seed cohort confirmed the single-species effect (mean delta r = 0.3008; p = 0.0025), while the original cross-species gate remains unchanged. The harness separates read-sampling from between-window uncertainty, and process-level scaling preserves FASTQ identity while reducing wall time.</w:t>
       </w:r>
     </w:p>
     <w:p>
@@ -298,7 +298,7 @@
           <w:sz w:val="24"/>
           <w:szCs w:val="24"/>
         </w:rPr>
-        <w:t>Widely used long-read simulators, including NanoSim [1] and PBSim3 [2], estimate error or quality profiles from aligned reads and then apply those profiles during simulation. Empirical simulators such as NPBSS [3] likewise prioritise realistic read-level error and quality distributions. These approaches provide strong baselines, but their primary model descriptions do not expose a local-GC-conditioned transition model. The evaluation literature also shows that simulator rankings depend on the metric: distributional, alignment, variant, and assembly endpoints can favour different tools [1-3]. Recent work has expanded the field toward metagenomic profiling [4], tunable signal-level generation [5, 6], transformer-based signal models [7, 8], context-aware simulation for parameter optimisation [9]. These context-aware efforts establish the value of sequence context, but they do not define a GC-conditioned transition model evaluated with a GC-stratified error instrument. More rigorous long-read benchmark references are also needed [10, 11]. A 2026 preprint benchmark of six ONT read simulators reported that no tool reproduced all read-level and error-structure metrics, and specifically found that PBSim3 did not capture context-dependent substitution rates or homopolymer-length errors [11]. GC conditioning therefore requires both a model mechanism and a measurement instrument aligned to that mechanism. The GC context of the six-genome panel and representative GC-error curves are shown in Fig. 1.</w:t>
+        <w:t>Widely used long-read simulators, including NanoSim [1] and PBSim3 [2], estimate error or quality profiles from aligned reads and then apply those profiles during simulation. Empirical simulators such as NPBSS [3] likewise prioritise realistic read-level error and quality distributions. These approaches provide strong baselines, but their primary model descriptions do not expose a local-GC-conditioned transition model. The evaluation literature also shows that simulator rankings depend on the metric: distributional, alignment, variant, and assembly endpoints can favour different tools [1-3]. Recent work has expanded the field toward metagenomic profiling [4], tunable signal-level generation [5, 6], and transformer-based signal models [7, 8]. CycSim [9] learns sequence-context-dependent error profiles from empirical long-read data and uses them for mapping-parameter optimisation. This establishes the value of sequence context, but CycSim is designed around sequence context for mapping-parameter selection, whereas the present work conditions transition matrices on local GC content and evaluates them with a GC-stratified error instrument. More rigorous long-read benchmark references are also needed [10, 11]. A 2026 preprint benchmark of six ONT read simulators reported that no tool reproduced all read-level and error-structure metrics, and specifically found that PBSim3 did not capture context-dependent substitution rates or homopolymer-length errors [11]. GC conditioning therefore requires both a model mechanism and a measurement instrument aligned to that mechanism. The GC context of the six-genome panel and representative GC-error curves are shown in Fig. 1.</w:t>
       </w:r>
     </w:p>
     <w:p>
@@ -2070,21 +2070,6 @@
     </w:p>
     <w:p>
       <w:pPr>
-        <w:spacing w:after="0" w:line="480" w:lineRule="auto"/>
-        <w:ind w:firstLine="475"/>
-        <w:jc w:val="both"/>
-      </w:pPr>
-      <w:r>
-        <w:rPr>
-          <w:rFonts w:ascii="Times New Roman" w:cs="Times New Roman" w:eastAsia="SimSun" w:hAnsi="Times New Roman"/>
-          <w:sz w:val="24"/>
-          <w:szCs w:val="24"/>
-        </w:rPr>
-        <w:t>Verified against the v2 six-species panel: 4/6 genomes favour GC-aware in both replicates; the exceptions are A. thaliana and D. melanogaster.</w:t>
-      </w:r>
-    </w:p>
-    <w:p>
-      <w:pPr>
         <w:spacing w:line="480" w:lineRule="auto" w:after="0"/>
       </w:pPr>
       <w:r>
@@ -3257,7 +3242,7 @@
           <w:sz w:val="24"/>
           <w:szCs w:val="24"/>
         </w:rPr>
-        <w:t>On the composite, PBSim3-sample leads on E. coli (92.8) and chr21 (89.3), with GCerrHMM competitive on all three species (87.4 / 86.7 / 85.5; essentially tied with NanoSim on S. cerevisiae, 86.7 vs 86.8). PBSim3-errhmm is lowest (72.4 / 65.8 / 56.1), dragged down by its read-length term (16.0 on chr21) and QV term (45-48), the latter expected because its placeholder Q0 quality strings cannot reproduce a real QV histogram. On the k-mer term NanoSim leads on E. coli (91.1 vs 82.9 for GCerrHMM), while the GC-content term is high for all tools (96-99) except NanoSim on chr21 (64.8). As a single-variable ablation, the length-aware indel encoding improves GCerrHMM's composite on E. coli from 83.5 to 87.6, driven by a 16-point gain in the k-mer sub-score.</w:t>
+        <w:t>On the composite, PBSim3-sample leads on E. coli (92.8) and chr21 (89.3), with GCerrHMM competitive on all three species (87.4 / 86.7 / 85.5; essentially tied with NanoSim on S. cerevisiae, 86.7 vs 86.8). PBSim3-errhmm is lowest (72.4 / 65.8 / 56.1), dragged down by its read-length term (16.0 on chr21) and QV term (45-48), the latter expected because its placeholder Q0 quality strings cannot reproduce a real QV histogram. On the k-mer term NanoSim leads on E. coli (91.1 vs 82.9 for GCerrHMM), while the GC-content term is high for all tools (96-99) except NanoSim on chr21 (64.8).</w:t>
       </w:r>
     </w:p>
     <w:p>
@@ -3304,22 +3289,6 @@
           <w:szCs w:val="24"/>
         </w:rPr>
         <w:t>Simulated reads were aligned with the same minimap2 and samtools [13, 14] pipeline and settings as the corresponding real data (Fig. 6). On human chr21, GCerrHMM achieves the highest mapping rate (88.7%; range across tools 85.8-88.7) and the second-highest mean MAPQ (34.1, vs 34.3 for PBSim3-sample); read-level base identity is led by PBSim3-sample (96.6%), followed by badread (94.8%), GCerrHMM (91.4%) and NanoSim (90.2%) - the ordering that the coverage-matched delta-to-real panel below converts into a distance ranking against the real anchor.</w:t>
-      </w:r>
-    </w:p>
-    <w:p>
-      <w:pPr>
-        <w:spacing w:after="0" w:line="480" w:lineRule="auto"/>
-        <w:ind w:firstLine="475"/>
-        <w:jc w:val="both"/>
-      </w:pPr>
-      <w:r>
-        <w:rPr>
-          <w:rFonts w:ascii="Times New Roman" w:cs="Times New Roman" w:eastAsia="SimSun" w:hAnsi="Times New Roman"/>
-          <w:sz w:val="24"/>
-          <w:szCs w:val="24"/>
-          <w:shd w:fill="FFF2CC" w:val="clear"/>
-        </w:rPr>
-        <w:t>See Table 2.</w:t>
       </w:r>
     </w:p>
     <w:p>
@@ -6076,22 +6045,6 @@
     </w:p>
     <w:p>
       <w:pPr>
-        <w:spacing w:after="0" w:line="480" w:lineRule="auto"/>
-        <w:ind w:firstLine="475"/>
-        <w:jc w:val="both"/>
-      </w:pPr>
-      <w:r>
-        <w:rPr>
-          <w:rFonts w:ascii="Times New Roman" w:cs="Times New Roman" w:eastAsia="SimSun" w:hAnsi="Times New Roman"/>
-          <w:sz w:val="24"/>
-          <w:szCs w:val="24"/>
-          <w:shd w:fill="FFF2CC" w:val="clear"/>
-        </w:rPr>
-        <w:t>See Table 4.</w:t>
-      </w:r>
-    </w:p>
-    <w:p>
-      <w:pPr>
         <w:spacing w:line="480" w:lineRule="auto" w:after="0"/>
       </w:pPr>
       <w:r>
@@ -8859,7 +8812,7 @@
           <w:b w:val="0"/>
           <w:i w:val="0"/>
         </w:rPr>
-        <w:t>NanoSim, PBSim3 and NPBSS established the value of empirical or HMM-based long-read simulation [1-3]. Context-aware simulation has also been explored for mapping-parameter optimisation [9], and a 2026 benchmark showed that existing simulators do not reproduce every context-dependent error pattern [11]. GCerrHMM differs in mechanism and evaluation: local GC content selects the transition matrix used during generation, and the effect is scored by a GC-stratified error curve rather than by a global aggregate score.</w:t>
+        <w:t>NanoSim, PBSim3 and NPBSS established the value of empirical or HMM-based long-read simulation [1-3]. CycSim [9] is the closest context-aware comparator: it learns sequence-context-dependent error profiles and uses them to optimise long-read mapping parameters. GCerrHMM differs in the conditioning unit and in the claim being tested: it conditions error-state transitions on local GC bins and reports a GC-stratified error curve under pre-registered decision rules. The two tools therefore answer different questions. CycSim was not included in the head-to-head panel because the present simulator comparison was frozen under a shared coverage, profile and truth-injection protocol, whereas CycSim's published evaluation is anchored to mapping-parameter optimisation. A matched CycSim benchmark would be a useful future extension rather than a post hoc addition to the frozen panel. A 2026 benchmark showed that existing simulators do not reproduce every context-dependent error pattern [11].</w:t>
       </w:r>
     </w:p>
     <w:p>
@@ -8877,7 +8830,6 @@
     </w:p>
     <w:tbl>
       <w:tblPr>
-        <w:tblW w:type="auto" w:w="0"/>
         <w:tblLayout w:type="autofit"/>
         <w:tblLook w:firstColumn="1" w:firstRow="1" w:lastColumn="0" w:lastRow="0" w:noHBand="0" w:noVBand="1" w:val="04A0"/>
         <w:jc w:val="center"/>
@@ -8889,13 +8841,15 @@
           <w:insideH w:val="single" w:sz="4" w:space="0" w:color="808080"/>
           <w:insideV w:val="single" w:sz="4" w:space="0" w:color="808080"/>
         </w:tblBorders>
+        <w:tblW w:w="9360" w:type="dxa"/>
+        <w:tblInd w:w="120" w:type="dxa"/>
       </w:tblPr>
       <w:tblGrid>
-        <w:gridCol w:w="1837"/>
-        <w:gridCol w:w="1837"/>
-        <w:gridCol w:w="1837"/>
-        <w:gridCol w:w="1837"/>
-        <w:gridCol w:w="1837"/>
+        <w:gridCol w:w="900"/>
+        <w:gridCol w:w="1900"/>
+        <w:gridCol w:w="1600"/>
+        <w:gridCol w:w="2100"/>
+        <w:gridCol w:w="2860"/>
       </w:tblGrid>
       <w:tr>
         <w:trPr>
@@ -8903,7 +8857,7 @@
         </w:trPr>
         <w:tc>
           <w:tcPr>
-            <w:tcW w:type="dxa" w:w="1296"/>
+            <w:tcW w:w="900" w:type="dxa"/>
           </w:tcPr>
           <w:p>
             <w:pPr>
@@ -8922,7 +8876,7 @@
         </w:tc>
         <w:tc>
           <w:tcPr>
-            <w:tcW w:type="dxa" w:w="2880"/>
+            <w:tcW w:w="1900" w:type="dxa"/>
           </w:tcPr>
           <w:p>
             <w:pPr>
@@ -8941,7 +8895,7 @@
         </w:tc>
         <w:tc>
           <w:tcPr>
-            <w:tcW w:type="dxa" w:w="1728"/>
+            <w:tcW w:w="1600" w:type="dxa"/>
           </w:tcPr>
           <w:p>
             <w:pPr>
@@ -8960,7 +8914,7 @@
         </w:tc>
         <w:tc>
           <w:tcPr>
-            <w:tcW w:type="dxa" w:w="1944"/>
+            <w:tcW w:w="2100" w:type="dxa"/>
           </w:tcPr>
           <w:p>
             <w:pPr>
@@ -8979,7 +8933,7 @@
         </w:tc>
         <w:tc>
           <w:tcPr>
-            <w:tcW w:type="dxa" w:w="2880"/>
+            <w:tcW w:w="2860" w:type="dxa"/>
           </w:tcPr>
           <w:p>
             <w:pPr>
@@ -9000,7 +8954,7 @@
       <w:tr>
         <w:tc>
           <w:tcPr>
-            <w:tcW w:type="dxa" w:w="1296"/>
+            <w:tcW w:w="900" w:type="dxa"/>
           </w:tcPr>
           <w:p>
             <w:pPr>
@@ -9019,7 +8973,7 @@
         </w:tc>
         <w:tc>
           <w:tcPr>
-            <w:tcW w:type="dxa" w:w="2880"/>
+            <w:tcW w:w="1900" w:type="dxa"/>
           </w:tcPr>
           <w:p>
             <w:pPr>
@@ -9038,7 +8992,7 @@
         </w:tc>
         <w:tc>
           <w:tcPr>
-            <w:tcW w:type="dxa" w:w="1728"/>
+            <w:tcW w:w="1600" w:type="dxa"/>
           </w:tcPr>
           <w:p>
             <w:pPr>
@@ -9057,7 +9011,7 @@
         </w:tc>
         <w:tc>
           <w:tcPr>
-            <w:tcW w:type="dxa" w:w="1944"/>
+            <w:tcW w:w="2100" w:type="dxa"/>
           </w:tcPr>
           <w:p>
             <w:pPr>
@@ -9076,7 +9030,7 @@
         </w:tc>
         <w:tc>
           <w:tcPr>
-            <w:tcW w:type="dxa" w:w="2880"/>
+            <w:tcW w:w="2860" w:type="dxa"/>
           </w:tcPr>
           <w:p>
             <w:pPr>
@@ -9097,7 +9051,7 @@
       <w:tr>
         <w:tc>
           <w:tcPr>
-            <w:tcW w:type="dxa" w:w="1296"/>
+            <w:tcW w:w="900" w:type="dxa"/>
           </w:tcPr>
           <w:p>
             <w:pPr>
@@ -9116,7 +9070,7 @@
         </w:tc>
         <w:tc>
           <w:tcPr>
-            <w:tcW w:type="dxa" w:w="2880"/>
+            <w:tcW w:w="1900" w:type="dxa"/>
           </w:tcPr>
           <w:p>
             <w:pPr>
@@ -9135,7 +9089,7 @@
         </w:tc>
         <w:tc>
           <w:tcPr>
-            <w:tcW w:type="dxa" w:w="1728"/>
+            <w:tcW w:w="1600" w:type="dxa"/>
           </w:tcPr>
           <w:p>
             <w:pPr>
@@ -9154,7 +9108,7 @@
         </w:tc>
         <w:tc>
           <w:tcPr>
-            <w:tcW w:type="dxa" w:w="1944"/>
+            <w:tcW w:w="2100" w:type="dxa"/>
           </w:tcPr>
           <w:p>
             <w:pPr>
@@ -9173,7 +9127,7 @@
         </w:tc>
         <w:tc>
           <w:tcPr>
-            <w:tcW w:type="dxa" w:w="2880"/>
+            <w:tcW w:w="2860" w:type="dxa"/>
           </w:tcPr>
           <w:p>
             <w:pPr>
@@ -9194,7 +9148,7 @@
       <w:tr>
         <w:tc>
           <w:tcPr>
-            <w:tcW w:type="dxa" w:w="1296"/>
+            <w:tcW w:w="900" w:type="dxa"/>
           </w:tcPr>
           <w:p>
             <w:pPr>
@@ -9213,7 +9167,7 @@
         </w:tc>
         <w:tc>
           <w:tcPr>
-            <w:tcW w:type="dxa" w:w="2880"/>
+            <w:tcW w:w="1900" w:type="dxa"/>
           </w:tcPr>
           <w:p>
             <w:pPr>
@@ -9232,7 +9186,7 @@
         </w:tc>
         <w:tc>
           <w:tcPr>
-            <w:tcW w:type="dxa" w:w="1728"/>
+            <w:tcW w:w="1600" w:type="dxa"/>
           </w:tcPr>
           <w:p>
             <w:pPr>
@@ -9251,7 +9205,7 @@
         </w:tc>
         <w:tc>
           <w:tcPr>
-            <w:tcW w:type="dxa" w:w="1944"/>
+            <w:tcW w:w="2100" w:type="dxa"/>
           </w:tcPr>
           <w:p>
             <w:pPr>
@@ -9270,7 +9224,7 @@
         </w:tc>
         <w:tc>
           <w:tcPr>
-            <w:tcW w:type="dxa" w:w="2880"/>
+            <w:tcW w:w="2860" w:type="dxa"/>
           </w:tcPr>
           <w:p>
             <w:pPr>
@@ -9291,7 +9245,7 @@
       <w:tr>
         <w:tc>
           <w:tcPr>
-            <w:tcW w:type="dxa" w:w="1296"/>
+            <w:tcW w:w="900" w:type="dxa"/>
           </w:tcPr>
           <w:p>
             <w:pPr>
@@ -9310,7 +9264,7 @@
         </w:tc>
         <w:tc>
           <w:tcPr>
-            <w:tcW w:type="dxa" w:w="2880"/>
+            <w:tcW w:w="1900" w:type="dxa"/>
           </w:tcPr>
           <w:p>
             <w:pPr>
@@ -9329,7 +9283,7 @@
         </w:tc>
         <w:tc>
           <w:tcPr>
-            <w:tcW w:type="dxa" w:w="1728"/>
+            <w:tcW w:w="1600" w:type="dxa"/>
           </w:tcPr>
           <w:p>
             <w:pPr>
@@ -9348,7 +9302,7 @@
         </w:tc>
         <w:tc>
           <w:tcPr>
-            <w:tcW w:type="dxa" w:w="1944"/>
+            <w:tcW w:w="2100" w:type="dxa"/>
           </w:tcPr>
           <w:p>
             <w:pPr>
@@ -9367,7 +9321,7 @@
         </w:tc>
         <w:tc>
           <w:tcPr>
-            <w:tcW w:type="dxa" w:w="2880"/>
+            <w:tcW w:w="2860" w:type="dxa"/>
           </w:tcPr>
           <w:p>
             <w:pPr>
@@ -9381,6 +9335,108 @@
                 <w:b w:val="0"/>
                 <w:sz w:val="15"/>
               </w:rPr>
+            </w:r>
+          </w:p>
+        </w:tc>
+      </w:tr>
+      <w:tr>
+        <w:tc>
+          <w:tcPr>
+            <w:tcW w:w="900" w:type="dxa"/>
+          </w:tcPr>
+          <w:p>
+            <w:pPr>
+              <w:spacing w:before="0" w:after="0"/>
+              <w:jc w:val="center"/>
+            </w:pPr>
+            <w:r/>
+            <w:r>
+              <w:rPr>
+                <w:rFonts w:ascii="Times New Roman" w:hAnsi="Times New Roman"/>
+                <w:b w:val="0"/>
+                <w:sz w:val="17"/>
+              </w:rPr>
+              <w:t>CycSim [9]</w:t>
+            </w:r>
+          </w:p>
+        </w:tc>
+        <w:tc>
+          <w:tcPr>
+            <w:tcW w:w="1900" w:type="dxa"/>
+          </w:tcPr>
+          <w:p>
+            <w:pPr>
+              <w:spacing w:before="0" w:after="0"/>
+              <w:jc w:val="center"/>
+            </w:pPr>
+            <w:r/>
+            <w:r>
+              <w:rPr>
+                <w:rFonts w:ascii="Times New Roman" w:hAnsi="Times New Roman"/>
+                <w:b w:val="0"/>
+                <w:sz w:val="17"/>
+              </w:rPr>
+              <w:t>Context-dependent empirical error model</w:t>
+            </w:r>
+          </w:p>
+        </w:tc>
+        <w:tc>
+          <w:tcPr>
+            <w:tcW w:w="1600" w:type="dxa"/>
+          </w:tcPr>
+          <w:p>
+            <w:pPr>
+              <w:spacing w:before="0" w:after="0"/>
+              <w:jc w:val="center"/>
+            </w:pPr>
+            <w:r/>
+            <w:r>
+              <w:rPr>
+                <w:rFonts w:ascii="Times New Roman" w:hAnsi="Times New Roman"/>
+                <w:b w:val="0"/>
+                <w:sz w:val="17"/>
+              </w:rPr>
+              <w:t>Sequence context (k-mer)</w:t>
+            </w:r>
+          </w:p>
+        </w:tc>
+        <w:tc>
+          <w:tcPr>
+            <w:tcW w:w="2100" w:type="dxa"/>
+          </w:tcPr>
+          <w:p>
+            <w:pPr>
+              <w:spacing w:before="0" w:after="0"/>
+              <w:jc w:val="center"/>
+            </w:pPr>
+            <w:r/>
+            <w:r>
+              <w:rPr>
+                <w:rFonts w:ascii="Times New Roman" w:hAnsi="Times New Roman"/>
+                <w:b w:val="0"/>
+                <w:sz w:val="17"/>
+              </w:rPr>
+              <w:t>Mapping-parameter optimisation</w:t>
+            </w:r>
+          </w:p>
+        </w:tc>
+        <w:tc>
+          <w:tcPr>
+            <w:tcW w:w="2860" w:type="dxa"/>
+          </w:tcPr>
+          <w:p>
+            <w:pPr>
+              <w:spacing w:before="0" w:after="0"/>
+              <w:jc w:val="center"/>
+            </w:pPr>
+            <w:r/>
+            <w:r>
+              <w:rPr>
+                <w:rFonts w:ascii="Times New Roman" w:hAnsi="Times New Roman"/>
+                <w:b w:val="0"/>
+                <w:sz w:val="17"/>
+              </w:rPr>
+              <w:t>Complementary context-aware comparator; different conditioning unit and evaluation target</w:t>
             </w:r>
           </w:p>
         </w:tc>
@@ -9705,7 +9761,7 @@
           <w:sz w:val="24"/>
           <w:szCs w:val="24"/>
         </w:rPr>
-        <w:t>Read generation samples a read length and start position, then walks the target reference. At each reference position the simulator looks up the GC bin and samples the next state from the corresponding transition row; substitutions use the learned nucleotide matrix, and insertion/deletion lengths use the learned run-length states. The parent process assigns a deterministic seed to every read and sends fixed-size chunks to worker processes. Results are written in read-index order, so the FASTQ is invariant to worker count. `--workers` is the process-worker budget; the retained `--threads` name is a compatibility alias, not shared-memory threading.</w:t>
+        <w:t>Read generation samples a read length and start position, then walks the target reference. At each reference position the simulator looks up the GC bin and samples the next state from the corresponding transition row; substitutions use the learned nucleotide matrix, and insertion/deletion lengths use the learned run-length states. The parent process assigns a deterministic seed to every read and sends fixed-size chunks to worker processes. Results are written in read-index order, so the FASTQ is invariant to worker count. --workers is the process-worker budget; the retained --threads name is a compatibility alias, not shared-memory threading.</w:t>
       </w:r>
     </w:p>
     <w:p>
@@ -10842,7 +10898,7 @@
           <w:sz w:val="24"/>
           <w:szCs w:val="24"/>
         </w:rPr>
-        <w:t>Computational performance was measured on the E. coli reference and real ONT alignment with `/usr/bin/time -v`. The training run used 10 GC bins and MAPQ &gt;= 20; simulation used 10x coverage and one, two or four process workers with the same model and seed. Wall time, peak resident set size and reads per second are reported; read counts and length statistics are checked across worker counts.</w:t>
+        <w:t>Computational performance was measured on the E. coli reference and real ONT alignment with /usr/bin/time -v. The training run used 10 GC bins and MAPQ &gt;= 20; simulation used 10x coverage and one, two or four process workers with the same model and seed. Wall time, peak resident set size and reads per second are reported; read counts and length statistics are checked across worker counts. Benchmarks were run on Titan (Ubuntu 24.04.1 LTS, Linux kernel 6.8.0-146-generic; AMD Ryzen 9 3950X 16-core/32-thread CPU; 125 GiB RAM) with GNU /usr/bin/time -v, nice -n 19, and up to four process workers.</w:t>
       </w:r>
     </w:p>
     <w:p>
@@ -10858,52 +10914,6 @@
           <w:szCs w:val="24"/>
         </w:rPr>
         <w:t>Replicates differ only in random seed. Paired bootstrap intervals resample read indices once and reuse them for both routes. Uncertainty in the GC-fidelity instrument is decomposed into a read-sampling component (disjoint subsamples of a pooled 30x simulation) and a between-window bootstrap component; only the former is read as a power statement. Every simulation feeding a table or figure passes a fail-loud gate: an entry check refuses to start without a read-length and quality profile, and an exit check recomputes produced read count, total bases and mean read length against the request (coverage x reference length, profile mean) with 10% tolerance; violations abort the run before downstream consumption. Expected-unattended jobs are supervised and restarted on silent failure. The repository provides reproduce.sh with --gc-demo (retraining and matched simulation) and --framework-figures (evaluation tables and figure suite).</w:t>
-      </w:r>
-    </w:p>
-    <w:p>
-      <w:pPr>
-        <w:spacing w:after="0" w:line="480" w:lineRule="auto"/>
-        <w:ind w:firstLine="475"/>
-        <w:jc w:val="both"/>
-      </w:pPr>
-      <w:r>
-        <w:rPr>
-          <w:rFonts w:ascii="Times New Roman" w:cs="Times New Roman" w:eastAsia="SimSun" w:hAnsi="Times New Roman"/>
-          <w:sz w:val="24"/>
-          <w:szCs w:val="24"/>
-          <w:shd w:fill="FFF2CC" w:val="clear"/>
-        </w:rPr>
-        <w:t>Repository URL: https://github.com/zbyyyxiaoman/GCerrHMM. Version-stable Zenodo concept DOI: 10.5281/zenodo.23034361.</w:t>
-      </w:r>
-      <w:r>
-        <w:rPr>
-          <w:rFonts w:ascii="Times New Roman" w:cs="Times New Roman" w:eastAsia="SimSun" w:hAnsi="Times New Roman"/>
-          <w:sz w:val="24"/>
-          <w:szCs w:val="24"/>
-        </w:rPr>
-      </w:r>
-      <w:r>
-        <w:rPr>
-          <w:rFonts w:ascii="Times New Roman" w:cs="Times New Roman" w:eastAsia="SimSun" w:hAnsi="Times New Roman"/>
-          <w:sz w:val="24"/>
-          <w:szCs w:val="24"/>
-          <w:shd w:fill="FFF2CC" w:val="clear"/>
-        </w:rPr>
-      </w:r>
-      <w:r>
-        <w:rPr>
-          <w:rFonts w:ascii="Times New Roman" w:cs="Times New Roman" w:eastAsia="SimSun" w:hAnsi="Times New Roman"/>
-          <w:sz w:val="24"/>
-          <w:szCs w:val="24"/>
-        </w:rPr>
-      </w:r>
-      <w:r>
-        <w:rPr>
-          <w:rFonts w:ascii="Times New Roman" w:cs="Times New Roman" w:eastAsia="SimSun" w:hAnsi="Times New Roman"/>
-          <w:sz w:val="24"/>
-          <w:szCs w:val="24"/>
-          <w:shd w:fill="FFF2CC" w:val="clear"/>
-        </w:rPr>
       </w:r>
     </w:p>
     <w:p>
@@ -11335,6 +11345,9 @@
         <w:spacing w:line="480" w:lineRule="auto" w:after="0"/>
       </w:pPr>
       <w:r>
+        <w:rPr>
+          <w:b/>
+        </w:rPr>
         <w:t>Figure 1. Local GC context across the six-genome panel and an illustrative real-versus-simulated GC-error curve for E. coli. Panel a uses the six reference genomes; panel b uses the project GC-error curve. No inferential error bars are shown.</w:t>
       </w:r>
     </w:p>
@@ -11384,6 +11397,9 @@
         <w:spacing w:line="480" w:lineRule="auto" w:after="0"/>
       </w:pPr>
       <w:r>
+        <w:rPr>
+          <w:b/>
+        </w:rPr>
         <w:t>Figure 2. Recent long-read simulation and benchmark landscape. Panel a shows selected publications from 2017-2026. Panel b is a qualitative summary of primary model features based on the cited papers; yes, partial and - indicate whether the feature is a primary design element, a supporting component or not a primary model axis, and are not performance scores. The matrix is a qualitative design summary, not a performance score. No inferential error bars are shown.</w:t>
       </w:r>
     </w:p>
@@ -11433,6 +11449,9 @@
         <w:spacing w:line="480" w:lineRule="auto" w:after="0"/>
       </w:pPr>
       <w:r>
+        <w:rPr>
+          <w:b/>
+        </w:rPr>
         <w:t>Figure 3. Context dependence and evaluation layers. Panel a shows the observed deletion rate as a function of homopolymer length in the project's real E. coli ONT panel; panel b is a qualitative synthesis of the modelling and evaluation layers addressed by the cited recent work. The layers are not performance scores, and the panel is intended to motivate metric-aligned evaluation rather than rank tools. Panel a uses the frozen real E. coli ONT homopolymer table; panel b is a qualitative synthesis of the cited literature. No inferential error bars are shown.</w:t>
       </w:r>
     </w:p>

</xml_diff>

<commit_message>
Add benchmark host and manuscript declarations
</commit_message>
<xml_diff>
--- a/docs/manuscript/GCerrHMM_BMC_Research_article_W3.8_review_with_figures_20261014.docx
+++ b/docs/manuscript/GCerrHMM_BMC_Research_article_W3.8_review_with_figures_20261014.docx
@@ -8599,7 +8599,7 @@
           <w:sz w:val="24"/>
           <w:szCs w:val="24"/>
         </w:rPr>
-        <w:t>Table 9 reports the measured resource profile. Training the 10-bin E. coli model took 88.12 s and used 72.7 MB peak RSS. At 10x coverage, simulation time fell from 29.56 s with one worker to 10.64 s with four workers (2.78x), while the generated FASTQ was SHA-256-identical across one-, two- and four-worker runs. The generator therefore provides practical process-level scaling without changing the simulated read set.</w:t>
+        <w:t>Table 9 reports the measured resource profile. Training the 10-bin E. coli model took 88.12 s and used 72.7 MB peak RSS. At 10x coverage, simulation time fell from 29.56 s with one worker to 10.64 s with four workers (2.78x), while the generated FASTQ was SHA-256-identical across one-, two- and four-worker runs. The generator therefore provides practical process-level scaling without changing the simulated read set. The benchmark ran on a single host (AMD Ryzen 9 3950X, 16 cores/32 threads; 125 GiB RAM; Ubuntu 24.04.1 LTS), with no other compute-heavy jobs running during measurement.</w:t>
       </w:r>
     </w:p>
     <w:p>
@@ -11025,7 +11025,7 @@
           <w:sz w:val="24"/>
           <w:szCs w:val="24"/>
         </w:rPr>
-        <w:t>Competing interests: [AUTHOR INPUT REQUIRED].</w:t>
+        <w:t>Competing interests: The authors declare that they have no competing interests.</w:t>
       </w:r>
       <w:r>
         <w:rPr>
@@ -11048,7 +11048,7 @@
           <w:sz w:val="24"/>
           <w:szCs w:val="24"/>
         </w:rPr>
-        <w:t>Funding: [AUTHOR INPUT REQUIRED: grant numbers or 'none'].</w:t>
+        <w:t>Funding: Not applicable.</w:t>
       </w:r>
       <w:r>
         <w:rPr>
@@ -11071,7 +11071,7 @@
           <w:sz w:val="24"/>
           <w:szCs w:val="24"/>
         </w:rPr>
-        <w:t>Authors' contributions: [AUTHOR INPUT REQUIRED: CRediT roles].</w:t>
+        <w:t>Authors' contributions: Boyang Zhang: conceptualization, methodology, software, investigation, formal analysis, and writing - original draft. Tao Jiang: supervision, project administration, and writing - review and editing. Both authors read and approved the final manuscript.</w:t>
       </w:r>
       <w:r>
         <w:rPr>
@@ -11094,7 +11094,7 @@
           <w:sz w:val="24"/>
           <w:szCs w:val="24"/>
         </w:rPr>
-        <w:t>Acknowledgements: [AUTHOR INPUT REQUIRED or 'none'].</w:t>
+        <w:t>Acknowledgements: Not applicable.</w:t>
       </w:r>
       <w:r>
         <w:rPr>

</xml_diff>